<commit_message>
fix: atualiza templates e modo autenticadores da TV
</commit_message>
<xml_diff>
--- a/public/templates/documentos/contrato-acao-isolada-template.docx
+++ b/public/templates/documentos/contrato-acao-isolada-template.docx
@@ -77,7 +77,7 @@
           <w:iCs/>
           <w:lang w:val="pt-BR"/>
         </w:rPr>
-        <w:t>{{NOME_CLIENTE}}</w:t>
+        <w:t>GIANI WONDOLINGER DUARTE ANDRADE</w:t>
       </w:r>
       <w:r>
         <w:rPr>
@@ -168,7 +168,7 @@
         <w:rPr>
           <w:rFonts w:asciiTheme="minorHAnsi" w:hAnsiTheme="minorHAnsi" w:cstheme="minorHAnsi"/>
         </w:rPr>
-        <w:t>{{CPF_CNPJ}}</w:t>
+        <w:t>758950646-04</w:t>
       </w:r>
       <w:r>
         <w:rPr>
@@ -210,7 +210,7 @@
           <w:rFonts w:asciiTheme="minorHAnsi" w:hAnsiTheme="minorHAnsi" w:cstheme="minorHAnsi"/>
           <w:lang w:val="pt-BR"/>
         </w:rPr>
-        <w:t>{{ENDERECO}}</w:t>
+        <w:t>Rua Fernando Pessoa</w:t>
       </w:r>
       <w:r>
         <w:rPr>
@@ -332,7 +332,7 @@
         <w:rPr>
           <w:rFonts w:asciiTheme="minorHAnsi" w:hAnsiTheme="minorHAnsi" w:cstheme="minorHAnsi"/>
         </w:rPr>
-        <w:t xml:space="preserve">, empresa inscrita no Cadastro Nacional da Pessoa Jurídica - CNPJ/MF sob o nº 09.020.119/0001-09 e na OAB/MG nº 2.422, com sede à rua Gonçalves Dias, nº 874 – 8º andar, bairro Savassi – {{FORO}} – CEP: 30.140-091, de agora em diante denominado </w:t>
+        <w:t xml:space="preserve">, empresa inscrita no Cadastro Nacional da Pessoa Jurídica - CNPJ/MF sob o nº 09.020.119/0001-09 e na OAB/MG nº 2.422, com sede à rua Gonçalves Dias, nº 874 – 8º andar, bairro Savassi – Belo Horizonte/MG – CEP: 30.140-091, de agora em diante denominado </w:t>
       </w:r>
       <w:r>
         <w:rPr>
@@ -525,7 +525,7 @@
         <w:rPr>
           <w:rFonts w:asciiTheme="minorHAnsi" w:hAnsiTheme="minorHAnsi" w:cstheme="minorHAnsi"/>
         </w:rPr>
-        <w:t>·         duas casas (uma em Vespasiano/MG e uma em {{FORO}});</w:t>
+        <w:t>·         duas casas (uma em Vespasiano/MG e uma em Belo Horizonte/MG);</w:t>
       </w:r>
     </w:p>
     <w:p>
@@ -566,7 +566,7 @@
         <w:rPr>
           <w:rFonts w:asciiTheme="minorHAnsi" w:hAnsiTheme="minorHAnsi" w:cstheme="minorHAnsi"/>
         </w:rPr>
-        <w:t xml:space="preserve"> em {{FORO}};</w:t>
+        <w:t xml:space="preserve"> em Belo Horizonte/MG;</w:t>
       </w:r>
     </w:p>
     <w:p>
@@ -1738,7 +1738,7 @@
           <w:sz w:val="24"/>
           <w:szCs w:val="24"/>
         </w:rPr>
-        <w:t xml:space="preserve">(dez mil reais) até o dia {{PRIMEIRA_PARCELA}}, a segunda </w:t>
+        <w:t xml:space="preserve">(dez mil reais) até o dia 13/03/2026, a segunda </w:t>
       </w:r>
       <w:r>
         <w:rPr>
@@ -2510,7 +2510,7 @@
           <w:szCs w:val="24"/>
         </w:rPr>
         <w:tab/>
-        <w:t>As partes elegem o foro de {{FORO}} para qualquer pend</w:t>
+        <w:t>As partes elegem o foro de Belo Horizonte/MG para qualquer pend</w:t>
       </w:r>
       <w:r>
         <w:rPr>

</xml_diff>

<commit_message>
fix: parametriza templates oficiais do gerador docx
</commit_message>
<xml_diff>
--- a/public/templates/documentos/contrato-acao-isolada-template.docx
+++ b/public/templates/documentos/contrato-acao-isolada-template.docx
@@ -168,7 +168,7 @@
         <w:rPr>
           <w:rFonts w:asciiTheme="minorHAnsi" w:hAnsiTheme="minorHAnsi" w:cstheme="minorHAnsi"/>
         </w:rPr>
-        <w:t>758950646-04</w:t>
+        <w:t>{{CPF_CNPJ}}</w:t>
       </w:r>
       <w:r>
         <w:rPr>
@@ -210,7 +210,7 @@
           <w:rFonts w:asciiTheme="minorHAnsi" w:hAnsiTheme="minorHAnsi" w:cstheme="minorHAnsi"/>
           <w:lang w:val="pt-BR"/>
         </w:rPr>
-        <w:t>Rua Fernando Pessoa</w:t>
+        <w:t>{{ENDERECO}}</w:t>
       </w:r>
       <w:r>
         <w:rPr>
@@ -310,7 +310,7 @@
           <w:b/>
           <w:bCs/>
         </w:rPr>
-        <w:t>CONTRATANTE</w:t>
+        <w:t>{{NOME_CLIENTE}}</w:t>
       </w:r>
       <w:r>
         <w:rPr>
@@ -332,7 +332,7 @@
         <w:rPr>
           <w:rFonts w:asciiTheme="minorHAnsi" w:hAnsiTheme="minorHAnsi" w:cstheme="minorHAnsi"/>
         </w:rPr>
-        <w:t xml:space="preserve">, empresa inscrita no Cadastro Nacional da Pessoa Jurídica - CNPJ/MF sob o nº 09.020.119/0001-09 e na OAB/MG nº 2.422, com sede à rua Gonçalves Dias, nº 874 – 8º andar, bairro Savassi – Belo Horizonte/MG – CEP: 30.140-091, de agora em diante denominado </w:t>
+        <w:t xml:space="preserve">, empresa inscrita no Cadastro Nacional da Pessoa Jurídica - CNPJ/MF sob o nº 09.020.119/0001-09 e na OAB/MG nº 2.422, com sede à rua Gonçalves Dias, nº 874 – 8º andar, bairro Savassi – {{FORO}} – CEP: 30.140-091, de agora em diante denominado </w:t>
       </w:r>
       <w:r>
         <w:rPr>
@@ -415,7 +415,7 @@
           <w:b/>
           <w:bCs/>
         </w:rPr>
-        <w:t>CONTRATANTE</w:t>
+        <w:t>{{NOME_CLIENTE}}</w:t>
       </w:r>
       <w:r>
         <w:rPr>
@@ -485,7 +485,7 @@
         <w:rPr>
           <w:rFonts w:asciiTheme="minorHAnsi" w:hAnsiTheme="minorHAnsi" w:cstheme="minorHAnsi"/>
         </w:rPr>
-        <w:t xml:space="preserve"> (três milhões e quinhentos mil reais)</w:t>
+        <w:t xml:space="preserve"> ({{OBJETO}})</w:t>
       </w:r>
       <w:r>
         <w:rPr>
@@ -525,7 +525,7 @@
         <w:rPr>
           <w:rFonts w:asciiTheme="minorHAnsi" w:hAnsiTheme="minorHAnsi" w:cstheme="minorHAnsi"/>
         </w:rPr>
-        <w:t>·         duas casas (uma em Vespasiano/MG e uma em Belo Horizonte/MG);</w:t>
+        <w:t>·         duas casas (uma em Vespasiano/MG e uma em {{FORO}});</w:t>
       </w:r>
     </w:p>
     <w:p>
@@ -566,7 +566,7 @@
         <w:rPr>
           <w:rFonts w:asciiTheme="minorHAnsi" w:hAnsiTheme="minorHAnsi" w:cstheme="minorHAnsi"/>
         </w:rPr>
-        <w:t xml:space="preserve"> em Belo Horizonte/MG;</w:t>
+        <w:t xml:space="preserve"> em {{FORO}};</w:t>
       </w:r>
     </w:p>
     <w:p>
@@ -1236,7 +1236,7 @@
           <w:b/>
           <w:bCs/>
         </w:rPr>
-        <w:t>CONTRATANTES</w:t>
+        <w:t>{{NOME_CLIENTE}}S</w:t>
       </w:r>
       <w:r>
         <w:rPr>
@@ -1336,7 +1336,7 @@
           <w:b/>
           <w:bCs/>
         </w:rPr>
-        <w:t>CONTRATANTES</w:t>
+        <w:t>{{NOME_CLIENTE}}S</w:t>
       </w:r>
       <w:r>
         <w:rPr>
@@ -1748,17 +1748,17 @@
           <w:sz w:val="24"/>
           <w:szCs w:val="24"/>
         </w:rPr>
-        <w:t>de R$ 5.000,00 (cinco mil reais)</w:t>
-      </w:r>
-      <w:r>
-        <w:rPr>
-          <w:rFonts w:asciiTheme="minorHAnsi" w:hAnsiTheme="minorHAnsi" w:cstheme="minorHAnsi"/>
-          <w:b w:val="0"/>
-          <w:bCs w:val="0"/>
-          <w:sz w:val="24"/>
-          <w:szCs w:val="24"/>
-        </w:rPr>
-        <w:t xml:space="preserve"> no dia 13/04/2026 e a terceira de R$ 5.000,00 (cinco mil reais), no dia 13/05/2026.</w:t>
+        <w:t>de {{HONORARIOS}}</w:t>
+      </w:r>
+      <w:r>
+        <w:rPr>
+          <w:rFonts w:asciiTheme="minorHAnsi" w:hAnsiTheme="minorHAnsi" w:cstheme="minorHAnsi"/>
+          <w:b w:val="0"/>
+          <w:bCs w:val="0"/>
+          <w:sz w:val="24"/>
+          <w:szCs w:val="24"/>
+        </w:rPr>
+        <w:t xml:space="preserve"> no dia 13/04/2026 e a terceira de {{HONORARIOS}}, no dia 13/05/2026.</w:t>
       </w:r>
     </w:p>
     <w:p>
@@ -1926,7 +1926,7 @@
           <w:sz w:val="24"/>
           <w:szCs w:val="24"/>
         </w:rPr>
-        <w:t>CONTRATANTES</w:t>
+        <w:t>{{NOME_CLIENTE}}S</w:t>
       </w:r>
       <w:r>
         <w:rPr>
@@ -2039,7 +2039,7 @@
           <w:sz w:val="24"/>
           <w:szCs w:val="24"/>
         </w:rPr>
-        <w:t>CONTRATANTES</w:t>
+        <w:t>{{NOME_CLIENTE}}S</w:t>
       </w:r>
       <w:r>
         <w:rPr>
@@ -2159,7 +2159,7 @@
           <w:sz w:val="24"/>
           <w:szCs w:val="24"/>
         </w:rPr>
-        <w:t>CONTRATANTES</w:t>
+        <w:t>{{NOME_CLIENTE}}S</w:t>
       </w:r>
       <w:r>
         <w:rPr>
@@ -2308,7 +2308,7 @@
           <w:sz w:val="24"/>
           <w:szCs w:val="24"/>
         </w:rPr>
-        <w:t>CONTRATANTES</w:t>
+        <w:t>{{NOME_CLIENTE}}S</w:t>
       </w:r>
       <w:r>
         <w:rPr>
@@ -2415,7 +2415,7 @@
           <w:sz w:val="24"/>
           <w:szCs w:val="24"/>
         </w:rPr>
-        <w:t>CONTRATANTES</w:t>
+        <w:t>{{NOME_CLIENTE}}S</w:t>
       </w:r>
       <w:r>
         <w:rPr>
@@ -2510,7 +2510,7 @@
           <w:szCs w:val="24"/>
         </w:rPr>
         <w:tab/>
-        <w:t>As partes elegem o foro de Belo Horizonte/MG para qualquer pend</w:t>
+        <w:t>As partes elegem o foro de {{FORO}} para qualquer pend</w:t>
       </w:r>
       <w:r>
         <w:rPr>

</xml_diff>